<commit_message>
Upgrade Cloud Computing internship to the enhanced 180 unique-topic program.
Import the Downloads Cloud package into the curriculum seed, rebuild study notes and instructions, and regenerate all Cloud day handbooks.

Co-authored-by: Cursor <cursoragent@cursor.com>
</commit_message>
<xml_diff>
--- a/laravel-app/database/data/internship/handbooks/cloud_computing/Beyond_Cloud_Internship_Day_001_Student_Handbook.docx
+++ b/laravel-app/database/data/internship/handbooks/cloud_computing/Beyond_Cloud_Internship_Day_001_Student_Handbook.docx
@@ -38,7 +38,7 @@
           <w:color w:val="1E293B"/>
           <w:sz w:val="28"/>
         </w:rPr>
-        <w:t>Cloud Concepts And Responsible Free-Tier Use</w:t>
+        <w:t>Cloud Concepts and Responsible Free-Tier Use</w:t>
       </w:r>
     </w:p>
     <w:p>
@@ -167,7 +167,7 @@
               <w:rPr>
                 <w:sz w:val="18"/>
               </w:rPr>
-              <w:t>8 hours</w:t>
+              <w:t>8.0 hours</w:t>
             </w:r>
           </w:p>
         </w:tc>
@@ -198,7 +198,7 @@
           <w:color w:val="0B3F90"/>
           <w:sz w:val="20"/>
         </w:rPr>
-        <w:t>Day 1 objective  Complete the orientation and setup for Cloud Concepts And Responsible Free-Tier Use: Apply cloud concepts and responsible free-tier use safely and explain the result in a professional technical report.</w:t>
+        <w:t>Day 1 objective  Complete the orientation and setup for Cloud Concepts and Responsible Free-Tier Use: Create an authorized cloud-lab readiness record, cost guardrails, and cleanup checklist.</w:t>
       </w:r>
     </w:p>
     <w:p>
@@ -256,7 +256,7 @@
           <w:b w:val="0"/>
           <w:sz w:val="22"/>
         </w:rPr>
-        <w:t>Submit: A setup screenshot, a short explanation of the key terms, and a safety/ethics check..</w:t>
+        <w:t>Submit: Setup evidence, completed lab artifact, independent verification, cost/cleanup record, safety check, and short technical report..</w:t>
       </w:r>
     </w:p>
     <w:p>
@@ -687,7 +687,7 @@
           <w:b w:val="0"/>
           <w:sz w:val="20"/>
         </w:rPr>
-        <w:t>Curriculum objective (source of truth): Apply cloud concepts and responsible free-tier use safely and explain the result in a professional technical report.</w:t>
+        <w:t>Curriculum objective (source of truth): Create an authorized cloud-lab readiness record, cost guardrails, and cleanup checklist.</w:t>
       </w:r>
     </w:p>
     <w:p>
@@ -699,7 +699,7 @@
           <w:b w:val="0"/>
           <w:sz w:val="22"/>
         </w:rPr>
-        <w:t>Explain Cloud Concepts And Responsible Free-Tier Use to a supervisor in under two minutes.</w:t>
+        <w:t>Explain Cloud Concepts and Responsible Free-Tier Use to a supervisor in under two minutes.</w:t>
       </w:r>
     </w:p>
     <w:p>
@@ -711,7 +711,7 @@
           <w:b w:val="0"/>
           <w:sz w:val="22"/>
         </w:rPr>
-        <w:t>Configure or verify the approved tools required for Cloud Concepts And Responsible Free-Tier Use.</w:t>
+        <w:t>Configure or verify the approved tools required for Cloud Concepts and Responsible Free-Tier Use.</w:t>
       </w:r>
     </w:p>
     <w:p>
@@ -779,7 +779,7 @@
           <w:b w:val="0"/>
           <w:sz w:val="22"/>
         </w:rPr>
-        <w:t>Define the professional meaning of “Cloud Concepts And Responsible Free-Tier Use” before you use tools. Do not split the title into meaningless words. Connect each concept to today's practical action.</w:t>
+        <w:t>Define the professional meaning of “Cloud Concepts and Responsible Free-Tier Use” before you use tools. Do not split the title into meaningless words. Connect each concept to today's practical action.</w:t>
       </w:r>
     </w:p>
     <w:tbl>
@@ -1663,7 +1663,7 @@
           <w:b w:val="0"/>
           <w:sz w:val="18"/>
         </w:rPr>
-        <w:t>└── Day_01_Cloud_Concepts_And_Responsible_Free_Tier_Use/</w:t>
+        <w:t>└── Day_01_Cloud_Concepts_and_Responsible_Free_Tier_Use/</w:t>
       </w:r>
     </w:p>
     <w:p>
@@ -1816,7 +1816,7 @@
           <w:b w:val="0"/>
           <w:sz w:val="18"/>
         </w:rPr>
-        <w:t>mkdir Beyond_Cloud_Internship\Day_01_Cloud_Concepts_And_Responsible_Free_Tier_Use\evidence, Beyond_Cloud_Internship\Day_01_Cloud_Concepts_And_Responsible_Free_Tier_Use\notebooks, Beyond_Cloud_Internship\Day_01_Cloud_Concepts_And_Responsible_Free_Tier_Use\src, Beyond_Cloud_Internship\Day_01_Cloud_Concepts_And_Responsible_Free_Tier_Use\data, Beyond_Cloud_Internship\Day_01_Cloud_Concepts_And_Responsible_Free_Tier_Use\output, Beyond_Cloud_Internship\Day_01_Cloud_Concepts_And_Responsible_Free_Tier_Use\report -Force</w:t>
+        <w:t>mkdir Beyond_Cloud_Internship\Day_01_Cloud_Concepts_and_Responsible_Free_Tier_Use\evidence, Beyond_Cloud_Internship\Day_01_Cloud_Concepts_and_Responsible_Free_Tier_Use\notebooks, Beyond_Cloud_Internship\Day_01_Cloud_Concepts_and_Responsible_Free_Tier_Use\src, Beyond_Cloud_Internship\Day_01_Cloud_Concepts_and_Responsible_Free_Tier_Use\data, Beyond_Cloud_Internship\Day_01_Cloud_Concepts_and_Responsible_Free_Tier_Use\output, Beyond_Cloud_Internship\Day_01_Cloud_Concepts_and_Responsible_Free_Tier_Use\report -Force</w:t>
       </w:r>
     </w:p>
     <w:p/>
@@ -1857,7 +1857,7 @@
           <w:b w:val="0"/>
           <w:sz w:val="18"/>
         </w:rPr>
-        <w:t>mkdir -p Beyond_Cloud_Internship/Day_01_Cloud_Concepts_And_Responsible_Free_Tier_Use/{evidence,notebooks,src,data,output,report}</w:t>
+        <w:t>mkdir -p Beyond_Cloud_Internship/Day_01_Cloud_Concepts_and_Responsible_Free_Tier_Use/{evidence,notebooks,src,data,output,report}</w:t>
       </w:r>
     </w:p>
     <w:p/>
@@ -1973,7 +1973,7 @@
           <w:color w:val="0B3F90"/>
           <w:sz w:val="24"/>
         </w:rPr>
-        <w:t>Orientation and setup: Cloud Concepts And Responsible Free-Tier Use</w:t>
+        <w:t>Orientation and setup: Cloud Concepts and Responsible Free-Tier Use</w:t>
       </w:r>
     </w:p>
     <w:p>
@@ -1997,7 +1997,7 @@
           <w:b w:val="0"/>
           <w:sz w:val="20"/>
         </w:rPr>
-        <w:t>• Read the Study Notes on this page, then create or verify the lab needed for cloud concepts and responsible free-tier use.</w:t>
+        <w:t>• Review Day 0 prerequisites and read the complete Day 1 objective before changing any lab resource.</w:t>
       </w:r>
     </w:p>
     <w:p>
@@ -2009,7 +2009,7 @@
           <w:b w:val="0"/>
           <w:sz w:val="20"/>
         </w:rPr>
-        <w:t>• Work only in an authorized lab, VM or on equipment assigned by Beyond.</w:t>
+        <w:t>• Confirm written authorization, account/sandbox boundary, region, quota, budget alert, and cleanup responsibility before provisioning.</w:t>
       </w:r>
     </w:p>
     <w:p>
@@ -2021,7 +2021,79 @@
           <w:b w:val="0"/>
           <w:sz w:val="20"/>
         </w:rPr>
-        <w:t>• Keep time entries truthful and ask the supervisor before changing production equipment.</w:t>
+        <w:t>• Verify only the tools required today and record versions; prefer local emulators when provider access or free-tier status is uncertain.</w:t>
+      </w:r>
+    </w:p>
+    <w:p>
+      <w:pPr>
+        <w:spacing w:after="120"/>
+      </w:pPr>
+      <w:r>
+        <w:rPr>
+          <w:b w:val="0"/>
+          <w:sz w:val="20"/>
+        </w:rPr>
+        <w:t>• Create Day_001_cloud_concepts_and_responsible_free_tier_use with evidence, config or src, output, and report folders. Prevent secrets and state files from entering version control.</w:t>
+      </w:r>
+    </w:p>
+    <w:p>
+      <w:pPr>
+        <w:spacing w:after="120"/>
+      </w:pPr>
+      <w:r>
+        <w:rPr>
+          <w:b w:val="0"/>
+          <w:sz w:val="20"/>
+        </w:rPr>
+        <w:t>• Complete the practical objective: Create an authorized cloud-lab readiness record, cost guardrails, and cleanup checklist.</w:t>
+      </w:r>
+    </w:p>
+    <w:p>
+      <w:pPr>
+        <w:spacing w:after="120"/>
+      </w:pPr>
+      <w:r>
+        <w:rPr>
+          <w:b w:val="0"/>
+          <w:sz w:val="20"/>
+        </w:rPr>
+        <w:t>• Record commands/configuration, expected result, observed result, resource identifiers without secrets, cost/usage check, and any deviations.</w:t>
+      </w:r>
+    </w:p>
+    <w:p>
+      <w:pPr>
+        <w:spacing w:after="120"/>
+      </w:pPr>
+      <w:r>
+        <w:rPr>
+          <w:b w:val="0"/>
+          <w:sz w:val="20"/>
+        </w:rPr>
+        <w:t>• Verify independently using a second command, connectivity test, configuration diff, monitoring view, clean rerun, restore test, or peer review.</w:t>
+      </w:r>
+    </w:p>
+    <w:p>
+      <w:pPr>
+        <w:spacing w:after="120"/>
+      </w:pPr>
+      <w:r>
+        <w:rPr>
+          <w:b w:val="0"/>
+          <w:sz w:val="20"/>
+        </w:rPr>
+        <w:t>• Stop and remove only assigned disposable resources; verify deletion, released IPs/storage, stopped services, and current billing/usage dashboard where applicable.</w:t>
+      </w:r>
+    </w:p>
+    <w:p>
+      <w:pPr>
+        <w:spacing w:after="120"/>
+      </w:pPr>
+      <w:r>
+        <w:rPr>
+          <w:b w:val="0"/>
+          <w:sz w:val="20"/>
+        </w:rPr>
+        <w:t>• Package evidence and write a professional report covering architecture, security, cost, verification, troubleshooting, limitations, and AI/tool assistance.</w:t>
       </w:r>
     </w:p>
     <w:p>
@@ -2047,7 +2119,7 @@
           <w:b w:val="0"/>
           <w:sz w:val="18"/>
         </w:rPr>
-        <w:t># day_01_lab.py — Orientation and setup: Cloud Concepts And Responsible Free-Tier Use</w:t>
+        <w:t># day_01_lab.py — Orientation and setup: Cloud Concepts and Responsible Free-Tier Use</w:t>
       </w:r>
     </w:p>
     <w:p>
@@ -2089,7 +2161,7 @@
           <w:b w:val="0"/>
           <w:sz w:val="18"/>
         </w:rPr>
-        <w:t>"""Day 1 practical starter for Cloud Concepts And Responsible Free-Tier Use.</w:t>
+        <w:t>"""Day 1 practical starter for Cloud Concepts and Responsible Free-Tier Use.</w:t>
       </w:r>
     </w:p>
     <w:p>
@@ -2271,7 +2343,7 @@
           <w:b w:val="0"/>
           <w:sz w:val="18"/>
         </w:rPr>
-        <w:t xml:space="preserve">    print("Program topic:", 'Cloud Concepts And Responsible Free-Tier Use')</w:t>
+        <w:t xml:space="preserve">    print("Program topic:", 'Cloud Concepts and Responsible Free-Tier Use')</w:t>
       </w:r>
     </w:p>
     <w:p>
@@ -5890,7 +5962,7 @@
           <w:b w:val="0"/>
           <w:sz w:val="22"/>
         </w:rPr>
-        <w:t>Objective addressed for Cloud Concepts And Responsible Free-Tier Use</w:t>
+        <w:t>Objective addressed for Cloud Concepts and Responsible Free-Tier Use</w:t>
       </w:r>
     </w:p>
     <w:p>
@@ -5994,7 +6066,7 @@
           <w:b w:val="0"/>
           <w:sz w:val="22"/>
         </w:rPr>
-        <w:t>Matches: A setup screenshot, a short explanation of the key terms, and a safety/ethics check.</w:t>
+        <w:t>Matches: Setup evidence, completed lab artifact, independent verification, cost/cleanup record, safety check, and short technical report.</w:t>
       </w:r>
     </w:p>
     <w:p>
@@ -6026,7 +6098,7 @@
           <w:b w:val="0"/>
           <w:sz w:val="22"/>
         </w:rPr>
-        <w:t>Explain Cloud Concepts And Responsible Free-Tier Use without reading.</w:t>
+        <w:t>Explain Cloud Concepts and Responsible Free-Tier Use without reading.</w:t>
       </w:r>
     </w:p>
     <w:p>
@@ -6118,7 +6190,7 @@
           <w:b w:val="0"/>
           <w:sz w:val="22"/>
         </w:rPr>
-        <w:t>Today is Day 1 (Orientation and setup) on Cloud Concepts And Responsible Free-Tier Use. I worked only in the authorized Beyond cloud lab. I completed the practical objective, verified with a second check, and packaged evidence. Main risk: unauthorized or unsafe action; control: checklist + supervisor escalation. Limitation: classroom/lab scope only. Next: continue the topic cycle and keep documentation reproducible.</w:t>
+        <w:t>Today is Day 1 (Orientation and setup) on Cloud Concepts and Responsible Free-Tier Use. I worked only in the authorized Beyond cloud lab. I completed the practical objective, verified with a second check, and packaged evidence. Main risk: unauthorized or unsafe action; control: checklist + supervisor escalation. Limitation: classroom/lab scope only. Next: continue the topic cycle and keep documentation reproducible.</w:t>
       </w:r>
     </w:p>
     <w:p>
@@ -6549,7 +6621,7 @@
           <w:b w:val="0"/>
           <w:sz w:val="22"/>
         </w:rPr>
-        <w:t>Access check date: 2026-08-09. Prefer first-party sources. Do not invent URLs.</w:t>
+        <w:t>Access check date: 2026-08-10. Prefer first-party sources. Do not invent URLs.</w:t>
       </w:r>
     </w:p>
     <w:p>

</xml_diff>